<commit_message>
feat(P3): regenerate jabs package (current content) + fix figure embedding across all P3 packages
- jabs_package: regenerate .md sources (manuscript verbatim from current mbr;
  JABS title+cover) replacing stale Jun-5 docx; P3 now has 4 complete current packages.
- Fix figure paths figures/vietnam/ -> figures/ (5 manuscripts); normalize jed
  figures to flat figures/; rebuild all P3 docx with --resource-path so the 6 figures
  embed (0 pandoc warnings). Figures verified present in every package.
</commit_message>
<xml_diff>
--- a/p3/submission/jabs_package/03_cover_letter.docx
+++ b/p3/submission/jabs_package/03_cover_letter.docx
@@ -2,20 +2,65 @@
 <file path=word/document.xml><?xml version="1.0" encoding="utf-8"?>
 <w:document xmlns:w="http://schemas.openxmlformats.org/wordprocessingml/2006/main" xmlns:m="http://schemas.openxmlformats.org/officeDocument/2006/math" xmlns:r="http://schemas.openxmlformats.org/officeDocument/2006/relationships" xmlns:o="urn:schemas-microsoft-com:office:office" xmlns:v="urn:schemas-microsoft-com:vml" xmlns:w10="urn:schemas-microsoft-com:office:word" xmlns:a="http://schemas.openxmlformats.org/drawingml/2006/main" xmlns:pic="http://schemas.openxmlformats.org/drawingml/2006/picture" xmlns:wp="http://schemas.openxmlformats.org/drawingml/2006/wordprocessingDrawing">
   <w:body>
+    <w:bookmarkStart w:id="21" w:name="X53c653b0d4a88dba744c54e64d24f61694137e9"/>
     <w:p>
       <w:pPr>
-        <w:pStyle w:val="FirstParagraph"/>
-      </w:pPr>
-      <w:r>
-        <w:t xml:space="preserve">15 May 2026</w:t>
+        <w:pStyle w:val="Heading1"/>
+      </w:pPr>
+      <w:r>
+        <w:t xml:space="preserve">Cover Letter — Journal of Asia Business Studies</w:t>
       </w:r>
     </w:p>
     <w:p>
       <w:pPr>
+        <w:pStyle w:val="FirstParagraph"/>
+      </w:pPr>
+      <w:r>
+        <w:t xml:space="preserve">The Editor-in-Chief</w:t>
+      </w:r>
+      <w:r>
+        <w:t xml:space="preserve"> </w:t>
+      </w:r>
+      <w:r>
+        <w:t xml:space="preserve">Journal of Asia Business Studies</w:t>
+      </w:r>
+      <w:r>
+        <w:t xml:space="preserve"> </w:t>
+      </w:r>
+      <w:r>
+        <w:t xml:space="preserve">Emerald Publishing</w:t>
+      </w:r>
+    </w:p>
+    <w:p>
+      <w:pPr>
         <w:pStyle w:val="BodyText"/>
       </w:pPr>
       <w:r>
-        <w:t xml:space="preserve">The Editor-in-Chief</w:t>
+        <w:t xml:space="preserve">Dear Editor-in-Chief,</w:t>
+      </w:r>
+    </w:p>
+    <w:p>
+      <w:pPr>
+        <w:pStyle w:val="BodyText"/>
+      </w:pPr>
+      <w:r>
+        <w:t xml:space="preserve">We are pleased to submit our manuscript,</w:t>
+      </w:r>
+      <w:r>
+        <w:t xml:space="preserve"> </w:t>
+      </w:r>
+      <w:r>
+        <w:rPr>
+          <w:bCs/>
+          <w:b/>
+        </w:rPr>
+        <w:t xml:space="preserve">"Revisiting the Internationalisation–Performance Relationship in an Emerging Market: The Roles of Technological Capability and Foundational Digital Adoption,"</w:t>
+      </w:r>
+      <w:r>
+        <w:t xml:space="preserve"> </w:t>
+      </w:r>
+      <w:r>
+        <w:t xml:space="preserve">for consideration in the</w:t>
       </w:r>
       <w:r>
         <w:t xml:space="preserve"> </w:t>
@@ -25,32 +70,26 @@
           <w:iCs/>
           <w:i/>
         </w:rPr>
-        <w:t xml:space="preserve">Journal of Asia Business Studies</w:t>
-      </w:r>
-      <w:r>
-        <w:t xml:space="preserve"> </w:t>
-      </w:r>
-      <w:r>
-        <w:t xml:space="preserve">Emerald Publishing</w:t>
+        <w:t xml:space="preserve">Journal of Asia Business Studies (JABS)</w:t>
+      </w:r>
+      <w:r>
+        <w:t xml:space="preserve">.</w:t>
       </w:r>
     </w:p>
     <w:p>
-      <w:r>
-        <w:pict>
-          <v:rect style="width:0;height:1.5pt" o:hralign="center" o:hrstd="t" o:hr="t"/>
-        </w:pict>
+      <w:pPr>
+        <w:pStyle w:val="BodyText"/>
+      </w:pPr>
+      <w:r>
+        <w:t xml:space="preserve">We revisit the internationalisation–performance (I–P) relationship in Vietnam, an emerging Asian economy, using firm-level World Bank Enterprise Survey data across three waves (2009, 2015, 2023; N = 2,958). We show that the inverted-U between export intensity and labour productivity is driven by a participation-margin step rather than within-exporter saturation, that its turning point is structurally durable across 14 years of institutional change (a narrow 39–46% FSTS band), and that technological capability and foundational (Tier-1) digital adoption behave differently: technological capability is identification-robust, whereas website-based digital presence follows a proxy-obsolescence trajectory across the three waves.</w:t>
       </w:r>
     </w:p>
     <w:p>
       <w:pPr>
-        <w:pStyle w:val="FirstParagraph"/>
-      </w:pPr>
-      <w:r>
-        <w:rPr>
-          <w:bCs/>
-          <w:b/>
-        </w:rPr>
-        <w:t xml:space="preserve">Submission of Manuscript: "Revisiting the Internationalisation–Performance Relationship in an Emerging Market: The Roles of Technological Capability and Foundational Digital Adoption"</w:t>
+        <w:pStyle w:val="BodyText"/>
+      </w:pPr>
+      <w:r>
+        <w:t xml:space="preserve">This study fits the scope of JABS, which advances theory and evidence on business in Asia and emerging-Asian economies. Vietnam offers an analytically valuable Asian setting in which institutional transition, uneven capability accumulation, and rapidly changing digital infrastructure unfold within a single economy, allowing the I–P relationship to be tested while holding the Asian institutional context constant. We believe the findings on threshold durability and stage-contingent digital value will be of clear interest to JABS readers working on internationalisation, firm capability, and digital transformation in Asia.</w:t>
       </w:r>
     </w:p>
     <w:p>
@@ -58,7 +97,7 @@
         <w:pStyle w:val="BodyText"/>
       </w:pPr>
       <w:r>
-        <w:t xml:space="preserve">Dear Editor-in-Chief,</w:t>
+        <w:t xml:space="preserve">The manuscript is original, has not been published, and is not under consideration elsewhere. All authors approved the submission and declare no conflicts of interest. We confirm the use of a writing-assistance tool (Grammarly) for language only; no generative AI produced substantive content.</w:t>
       </w:r>
     </w:p>
     <w:p>
@@ -66,23 +105,7 @@
         <w:pStyle w:val="BodyText"/>
       </w:pPr>
       <w:r>
-        <w:t xml:space="preserve">We are pleased to submit the above manuscript for consideration for publication in the</w:t>
-      </w:r>
-      <w:r>
-        <w:t xml:space="preserve"> </w:t>
-      </w:r>
-      <w:r>
-        <w:rPr>
-          <w:iCs/>
-          <w:i/>
-        </w:rPr>
-        <w:t xml:space="preserve">Journal of Asia Business Studies</w:t>
-      </w:r>
-      <w:r>
-        <w:t xml:space="preserve"> </w:t>
-      </w:r>
-      <w:r>
-        <w:t xml:space="preserve">(JABS). The manuscript presents an empirical study of the internationalisation–performance (I–P) relationship using three waves of World Bank Enterprise Survey data for Vietnam (2009, 2015, 2023; N = 2,958).</w:t>
+        <w:t xml:space="preserve">Thank you for your consideration.</w:t>
       </w:r>
     </w:p>
     <w:p>
@@ -90,281 +113,18 @@
         <w:pStyle w:val="BodyText"/>
       </w:pPr>
       <w:r>
-        <w:rPr>
-          <w:bCs/>
-          <w:b/>
-        </w:rPr>
-        <w:t xml:space="preserve">Fit with JABS</w:t>
-      </w:r>
-    </w:p>
-    <w:p>
-      <w:pPr>
-        <w:pStyle w:val="BodyText"/>
-      </w:pPr>
-      <w:r>
-        <w:t xml:space="preserve">JABS is the natural venue for this work. The manuscript addresses a phenomenon that is specifically Asian in character: the conditions under which foundational digital adoption drives — or fails to drive — export-led productivity gains in a transitional lower-middle-income economy undergoing rapid institutional change. Vietnam represents exactly the kind of single-country, phenomenon-driven context that JABS prizes: analytically informative, theoretically productive, and practically consequential for policy design in comparable economies across the ASEAN development spectrum. The three-wave design (spanning WTO accession in 2007, CPTPP ratification in 2019, and the post-COVID digital economy push in 2023) positions Vietnam as a leading-indicator case for emerging economies whose institutional trajectories lag by five to fifteen years. The paper can be read as a boundary-condition test of the positive I–P average documented in cross-country meta-analyses (Wu, Fan, &amp; Chen, 2022,</w:t>
+        <w:t xml:space="preserve">Sincerely,</w:t>
       </w:r>
       <w:r>
         <w:t xml:space="preserve"> </w:t>
       </w:r>
       <w:r>
-        <w:rPr>
-          <w:iCs/>
-          <w:i/>
-        </w:rPr>
-        <w:t xml:space="preserve">Management International Review</w:t>
-      </w:r>
-      <w:r>
-        <w:t xml:space="preserve">): Vietnam's within-country evidence confirms that functional-form heterogeneity is preserved at the single-country level in ways that pooled cross-national estimates obscure.</w:t>
-      </w:r>
-    </w:p>
-    <w:p>
-      <w:pPr>
-        <w:pStyle w:val="BodyText"/>
-      </w:pPr>
-      <w:r>
-        <w:rPr>
-          <w:bCs/>
-          <w:b/>
-        </w:rPr>
-        <w:t xml:space="preserve">Key Contributions</w:t>
-      </w:r>
-    </w:p>
-    <w:p>
-      <w:pPr>
-        <w:pStyle w:val="BodyText"/>
-      </w:pPr>
-      <w:r>
-        <w:t xml:space="preserve">First, the study provides multi-wave within-country evidence that the inverted-U between export intensity and labour productivity is structurally durable: turning points cluster at 39–46% across all three waves (Lind–Mehlum test p ≤ .013 per wave; p &lt; .001 pooled), a 7-percentage-point band sustained through 14 years of major institutional change. This durability — confirmed against Pisani, Garcia-Bernardo, and Heemskerk's (2020,</w:t>
+        <w:t xml:space="preserve">Phan Anh Tú (corresponding author), College of Economics, Can Tho University, Vietnam ·</w:t>
       </w:r>
       <w:r>
         <w:t xml:space="preserve"> </w:t>
       </w:r>
-      <w:r>
-        <w:rPr>
-          <w:iCs/>
-          <w:i/>
-        </w:rPr>
-        <w:t xml:space="preserve">Strategic Management Journal</w:t>
-      </w:r>
-      <w:r>
-        <w:t xml:space="preserve">) cross-national skepticism — is most informative as a boundary-condition finding rather than a replication, because it establishes that single-country institutional contexts preserve functional-form regularity that cross-national pooling obscures.</w:t>
-      </w:r>
-    </w:p>
-    <w:p>
-      <w:pPr>
-        <w:pStyle w:val="BodyText"/>
-      </w:pPr>
-      <w:r>
-        <w:t xml:space="preserve">Second, the study is the first systematic separation of technological capability (TCI: quality certification, foreign-licensed technology) from foundational digital adoption (DAI: website presence, Tier-1 only) as non-overlapping primary constructs in a WBES-based I–P study. Technological capability is robustly positive across all waves (β = 0.123–0.215); the website-based digital indicator undergoes a trajectory consistent with Tier-1 proxy obsolescence (positive in 2009, null in 2015, negatively interactive with export intensity in 2023). Instrumental-variable estimation attributes the pooled DAI association to selection rather than productive capacity.</w:t>
-      </w:r>
-    </w:p>
-    <w:p>
-      <w:pPr>
-        <w:pStyle w:val="BodyText"/>
-      </w:pPr>
-      <w:r>
-        <w:t xml:space="preserve">Third, Paternoster cross-wave z-tests confirm that the 2009–2015 fall in the digital-adoption productivity association (z = 3.353, p &lt; .001) and its 2015–2023 partial recovery (z = −2.051, p = .040) are statistically distinguishable shifts — an empirical pattern that carries direct policy implications for digital-economy programme design in transitional economies.</w:t>
-      </w:r>
-    </w:p>
-    <w:p>
-      <w:pPr>
-        <w:pStyle w:val="BodyText"/>
-      </w:pPr>
-      <w:r>
-        <w:rPr>
-          <w:bCs/>
-          <w:b/>
-        </w:rPr>
-        <w:t xml:space="preserve">Originality and Declaration</w:t>
-      </w:r>
-    </w:p>
-    <w:p>
-      <w:pPr>
-        <w:pStyle w:val="BodyText"/>
-      </w:pPr>
-      <w:r>
-        <w:t xml:space="preserve">This manuscript is original, has not been published previously, and is not under consideration elsewhere. All authors approve the submission. The authors declare no conflict of interest. No specific grant from any funding agency was received. The use of WBES data is subject to the World Bank's standard data agreement; the raw microdata will be made available to the editorial team upon request, consistent with World Bank open-data policy.</w:t>
-      </w:r>
-    </w:p>
-    <w:p>
-      <w:pPr>
-        <w:pStyle w:val="BodyText"/>
-      </w:pPr>
-      <w:r>
-        <w:rPr>
-          <w:bCs/>
-          <w:b/>
-        </w:rPr>
-        <w:t xml:space="preserve">Manuscript Classification</w:t>
-      </w:r>
-    </w:p>
-    <w:p>
-      <w:pPr>
-        <w:numPr>
-          <w:ilvl w:val="0"/>
-          <w:numId w:val="1001"/>
-        </w:numPr>
-        <w:pStyle w:val="Compact"/>
-      </w:pPr>
-      <w:r>
-        <w:t xml:space="preserve">Paper type: Research article</w:t>
-      </w:r>
-    </w:p>
-    <w:p>
-      <w:pPr>
-        <w:numPr>
-          <w:ilvl w:val="0"/>
-          <w:numId w:val="1001"/>
-        </w:numPr>
-        <w:pStyle w:val="Compact"/>
-      </w:pPr>
-      <w:r>
-        <w:t xml:space="preserve">Word count (main text, excluding abstract, references, tables, and figures): approximately 6,800 words</w:t>
-      </w:r>
-    </w:p>
-    <w:p>
-      <w:pPr>
-        <w:numPr>
-          <w:ilvl w:val="0"/>
-          <w:numId w:val="1001"/>
-        </w:numPr>
-        <w:pStyle w:val="Compact"/>
-      </w:pPr>
-      <w:r>
-        <w:t xml:space="preserve">Tables: 4; Figures: 6</w:t>
-      </w:r>
-    </w:p>
-    <w:p>
-      <w:pPr>
-        <w:numPr>
-          <w:ilvl w:val="0"/>
-          <w:numId w:val="1001"/>
-        </w:numPr>
-        <w:pStyle w:val="Compact"/>
-      </w:pPr>
-      <w:r>
-        <w:t xml:space="preserve">Keywords: internationalisation–performance; emerging markets; digital adoption; technological capability; Vietnam; threshold durability</w:t>
-      </w:r>
-    </w:p>
-    <w:p>
-      <w:pPr>
-        <w:numPr>
-          <w:ilvl w:val="0"/>
-          <w:numId w:val="1001"/>
-        </w:numPr>
-        <w:pStyle w:val="Compact"/>
-      </w:pPr>
-      <w:r>
-        <w:t xml:space="preserve">JEL classification: F23, O33, D22, L25, O53</w:t>
-      </w:r>
-    </w:p>
-    <w:p>
-      <w:pPr>
-        <w:pStyle w:val="FirstParagraph"/>
-      </w:pPr>
-      <w:r>
-        <w:t xml:space="preserve">We hope the manuscript will be of interest to JABS's readership. We look forward to the review process.</w:t>
-      </w:r>
-    </w:p>
-    <w:p>
-      <w:pPr>
-        <w:pStyle w:val="BodyText"/>
-      </w:pPr>
-      <w:r>
-        <w:t xml:space="preserve">Yours sincerely,</w:t>
-      </w:r>
-    </w:p>
-    <w:p>
-      <w:pPr>
-        <w:pStyle w:val="BodyText"/>
-      </w:pPr>
-      <w:r>
-        <w:rPr>
-          <w:bCs/>
-          <w:b/>
-        </w:rPr>
-        <w:t xml:space="preserve">Đỗ Thùy Hương (Do Thuy Huong)</w:t>
-      </w:r>
-      <w:r>
-        <w:t xml:space="preserve"> </w:t>
-      </w:r>
-      <w:r>
-        <w:t xml:space="preserve">PhD Candidate</w:t>
-      </w:r>
-      <w:r>
-        <w:t xml:space="preserve"> </w:t>
-      </w:r>
-      <w:r>
-        <w:t xml:space="preserve">College of Economics, Can Tho University (CTU), Vietnam</w:t>
-      </w:r>
-      <w:r>
-        <w:t xml:space="preserve"> </w:t>
-      </w:r>
-      <w:r>
-        <w:t xml:space="preserve">Email:</w:t>
-      </w:r>
-      <w:r>
-        <w:t xml:space="preserve"> </w:t>
-      </w:r>
       <w:hyperlink r:id="rId20">
-        <w:r>
-          <w:rPr>
-            <w:rStyle w:val="Hyperlink"/>
-          </w:rPr>
-          <w:t xml:space="preserve">huongp1323001@gstudent.ctu.edu.vn</w:t>
-        </w:r>
-      </w:hyperlink>
-      <w:r>
-        <w:t xml:space="preserve"> </w:t>
-      </w:r>
-      <w:r>
-        <w:t xml:space="preserve">| ORCID: 0000-0002-7711-2487</w:t>
-      </w:r>
-    </w:p>
-    <w:p>
-      <w:pPr>
-        <w:pStyle w:val="BodyText"/>
-      </w:pPr>
-      <w:r>
-        <w:rPr>
-          <w:bCs/>
-          <w:b/>
-        </w:rPr>
-        <w:t xml:space="preserve">PGS.TS. Phan Anh Tú (Phan Anh Tu)</w:t>
-      </w:r>
-      <w:r>
-        <w:t xml:space="preserve"> </w:t>
-      </w:r>
-      <w:r>
-        <w:t xml:space="preserve">Associate Professor, College of Economics</w:t>
-      </w:r>
-      <w:r>
-        <w:t xml:space="preserve"> </w:t>
-      </w:r>
-      <w:r>
-        <w:t xml:space="preserve">Can Tho University (CTU), Vietnam</w:t>
-      </w:r>
-      <w:r>
-        <w:t xml:space="preserve"> </w:t>
-      </w:r>
-      <w:r>
-        <w:rPr>
-          <w:iCs/>
-          <w:i/>
-        </w:rPr>
-        <w:t xml:space="preserve">Corresponding author</w:t>
-      </w:r>
-      <w:r>
-        <w:t xml:space="preserve"> </w:t>
-      </w:r>
-      <w:r>
-        <w:t xml:space="preserve">Email:</w:t>
-      </w:r>
-      <w:r>
-        <w:t xml:space="preserve"> </w:t>
-      </w:r>
-      <w:hyperlink r:id="rId21">
         <w:r>
           <w:rPr>
             <w:rStyle w:val="Hyperlink"/>
@@ -372,17 +132,9 @@
           <w:t xml:space="preserve">patu@ctu.edu.vn</w:t>
         </w:r>
       </w:hyperlink>
-      <w:r>
-        <w:t xml:space="preserve"> </w:t>
-      </w:r>
-      <w:r>
-        <w:t xml:space="preserve">| ORCID: 0000-0003-0667-3137</w:t>
-      </w:r>
     </w:p>
-    <w:sectPr>
-      <w:pgSz w:h="16838" w:w="11906"/>
-      <w:pgMar w:bottom="1417" w:left="1417" w:right="1417" w:top="1417"/>
-    </w:sectPr>
+    <w:bookmarkEnd w:id="21"/>
+    <w:sectPr/>
   </w:body>
 </w:document>
 </file>
@@ -488,87 +240,8 @@
       </w:pPr>
     </w:lvl>
   </w:abstractNum>
-  <w:abstractNum w:abstractNumId="991">
-    <w:nsid w:val="A991"/>
-    <w:multiLevelType w:val="multilevel"/>
-    <w:lvl w:ilvl="0">
-      <w:numFmt w:val="bullet"/>
-      <w:lvlText w:val="•"/>
-      <w:lvlJc w:val="left"/>
-      <w:pPr>
-        <w:ind w:left="720" w:hanging="480"/>
-      </w:pPr>
-    </w:lvl>
-    <w:lvl w:ilvl="1">
-      <w:numFmt w:val="bullet"/>
-      <w:lvlText w:val="–"/>
-      <w:lvlJc w:val="left"/>
-      <w:pPr>
-        <w:ind w:left="1440" w:hanging="480"/>
-      </w:pPr>
-    </w:lvl>
-    <w:lvl w:ilvl="2">
-      <w:numFmt w:val="bullet"/>
-      <w:lvlText w:val="•"/>
-      <w:lvlJc w:val="left"/>
-      <w:pPr>
-        <w:ind w:left="2160" w:hanging="480"/>
-      </w:pPr>
-    </w:lvl>
-    <w:lvl w:ilvl="3">
-      <w:numFmt w:val="bullet"/>
-      <w:lvlText w:val="–"/>
-      <w:lvlJc w:val="left"/>
-      <w:pPr>
-        <w:ind w:left="2880" w:hanging="480"/>
-      </w:pPr>
-    </w:lvl>
-    <w:lvl w:ilvl="4">
-      <w:numFmt w:val="bullet"/>
-      <w:lvlText w:val="•"/>
-      <w:lvlJc w:val="left"/>
-      <w:pPr>
-        <w:ind w:left="3600" w:hanging="480"/>
-      </w:pPr>
-    </w:lvl>
-    <w:lvl w:ilvl="5">
-      <w:numFmt w:val="bullet"/>
-      <w:lvlText w:val="–"/>
-      <w:lvlJc w:val="left"/>
-      <w:pPr>
-        <w:ind w:left="4320" w:hanging="480"/>
-      </w:pPr>
-    </w:lvl>
-    <w:lvl w:ilvl="6">
-      <w:numFmt w:val="bullet"/>
-      <w:lvlText w:val="•"/>
-      <w:lvlJc w:val="left"/>
-      <w:pPr>
-        <w:ind w:left="5040" w:hanging="480"/>
-      </w:pPr>
-    </w:lvl>
-    <w:lvl w:ilvl="7">
-      <w:numFmt w:val="bullet"/>
-      <w:lvlText w:val="–"/>
-      <w:lvlJc w:val="left"/>
-      <w:pPr>
-        <w:ind w:left="5760" w:hanging="480"/>
-      </w:pPr>
-    </w:lvl>
-    <w:lvl w:ilvl="8">
-      <w:numFmt w:val="bullet"/>
-      <w:lvlText w:val="•"/>
-      <w:lvlJc w:val="left"/>
-      <w:pPr>
-        <w:ind w:left="6480" w:hanging="480"/>
-      </w:pPr>
-    </w:lvl>
-  </w:abstractNum>
   <w:num w:numId="1000">
     <w:abstractNumId w:val="990"/>
-  </w:num>
-  <w:num w:numId="1001">
-    <w:abstractNumId w:val="991"/>
   </w:num>
 </w:numbering>
 </file>
@@ -594,59 +267,29 @@
   <w:style w:default="1" w:styleId="Normal" w:type="paragraph">
     <w:name w:val="Normal"/>
     <w:qFormat/>
-    <w:pPr>
-      <w:spacing w:line="276" w:lineRule="auto"/>
-      <w:jc w:val="both"/>
-    </w:pPr>
-    <w:rPr>
-      <w:rFonts w:ascii="Times New Roman" w:eastAsia="Times New Roman" w:hAnsi="Times New Roman"/>
-      <w:color w:val="000000"/>
-      <w:sz w:val="24"/>
-    </w:rPr>
   </w:style>
   <w:style w:styleId="BodyText" w:type="paragraph">
     <w:name w:val="Body Text"/>
     <w:basedOn w:val="Normal"/>
     <w:link w:val="BodyTextChar"/>
     <w:pPr>
-      <w:spacing w:after="180" w:before="180" w:line="276" w:lineRule="auto"/>
-      <w:jc w:val="both"/>
-    </w:pPr>
-    <w:qFormat/>
-    <w:rPr>
-      <w:rFonts w:ascii="Times New Roman" w:eastAsia="Times New Roman" w:hAnsi="Times New Roman"/>
-      <w:color w:val="000000"/>
-      <w:sz w:val="24"/>
-    </w:rPr>
+      <w:spacing w:after="180" w:before="180"/>
+    </w:pPr>
+    <w:qFormat/>
   </w:style>
   <w:style w:customStyle="1" w:styleId="FirstParagraph" w:type="paragraph">
     <w:name w:val="First Paragraph"/>
     <w:basedOn w:val="BodyText"/>
     <w:next w:val="BodyText"/>
     <w:qFormat/>
-    <w:pPr>
-      <w:spacing w:line="276" w:lineRule="auto"/>
-      <w:jc w:val="both"/>
-    </w:pPr>
-    <w:rPr>
-      <w:rFonts w:ascii="Times New Roman" w:eastAsia="Times New Roman" w:hAnsi="Times New Roman"/>
-      <w:color w:val="000000"/>
-      <w:sz w:val="24"/>
-    </w:rPr>
   </w:style>
   <w:style w:customStyle="1" w:styleId="Compact" w:type="paragraph">
     <w:name w:val="Compact"/>
     <w:basedOn w:val="BodyText"/>
     <w:qFormat/>
     <w:pPr>
-      <w:spacing w:after="36" w:before="36" w:line="276" w:lineRule="auto"/>
-      <w:jc w:val="both"/>
-    </w:pPr>
-    <w:rPr>
-      <w:rFonts w:ascii="Times New Roman" w:eastAsia="Times New Roman" w:hAnsi="Times New Roman"/>
-      <w:color w:val="000000"/>
-      <w:sz w:val="24"/>
-    </w:rPr>
+      <w:spacing w:after="36" w:before="36"/>
+    </w:pPr>
   </w:style>
   <w:style w:styleId="Title" w:type="paragraph">
     <w:name w:val="Title"/>
@@ -656,15 +299,15 @@
     <w:pPr>
       <w:keepNext/>
       <w:keepLines/>
-      <w:spacing w:after="240" w:before="480" w:line="276" w:lineRule="auto"/>
-      <w:jc w:val="both"/>
-    </w:pPr>
-    <w:rPr>
-      <w:rFonts w:ascii="Times New Roman" w:asciiTheme="majorHAnsi" w:cstheme="majorBidi" w:eastAsia="Times New Roman" w:eastAsiaTheme="majorEastAsia" w:hAnsi="Times New Roman" w:hAnsiTheme="majorHAnsi"/>
+      <w:spacing w:after="240" w:before="480"/>
+      <w:jc w:val="center"/>
+    </w:pPr>
+    <w:rPr>
+      <w:rFonts w:asciiTheme="majorHAnsi" w:cstheme="majorBidi" w:eastAsiaTheme="majorEastAsia" w:hAnsiTheme="majorHAnsi"/>
       <w:b/>
       <w:bCs/>
-      <w:color w:val="000000"/>
-      <w:sz w:val="24"/>
+      <w:color w:themeColor="accent1" w:themeShade="B5" w:val="345A8A"/>
+      <w:sz w:val="36"/>
       <w:szCs w:val="36"/>
     </w:rPr>
   </w:style>
@@ -676,13 +319,11 @@
     <w:pPr>
       <w:keepNext/>
       <w:keepLines/>
-      <w:spacing w:after="240" w:before="240" w:line="276" w:lineRule="auto"/>
-      <w:jc w:val="both"/>
-    </w:pPr>
-    <w:rPr>
-      <w:rFonts w:ascii="Times New Roman" w:eastAsia="Times New Roman" w:hAnsi="Times New Roman"/>
-      <w:color w:val="000000"/>
-      <w:sz w:val="24"/>
+      <w:spacing w:after="240" w:before="240"/>
+      <w:jc w:val="center"/>
+    </w:pPr>
+    <w:rPr>
+      <w:sz w:val="30"/>
       <w:szCs w:val="30"/>
     </w:rPr>
   </w:style>
@@ -693,14 +334,8 @@
     <w:pPr>
       <w:keepNext/>
       <w:keepLines/>
-      <w:spacing w:line="276" w:lineRule="auto"/>
-      <w:jc w:val="both"/>
-    </w:pPr>
-    <w:rPr>
-      <w:rFonts w:ascii="Times New Roman" w:eastAsia="Times New Roman" w:hAnsi="Times New Roman"/>
-      <w:color w:val="000000"/>
-      <w:sz w:val="24"/>
-    </w:rPr>
+      <w:jc w:val="center"/>
+    </w:pPr>
   </w:style>
   <w:style w:styleId="Date" w:type="paragraph">
     <w:name w:val="Date"/>
@@ -709,14 +344,8 @@
     <w:pPr>
       <w:keepNext/>
       <w:keepLines/>
-      <w:spacing w:line="276" w:lineRule="auto"/>
-      <w:jc w:val="both"/>
-    </w:pPr>
-    <w:rPr>
-      <w:rFonts w:ascii="Times New Roman" w:eastAsia="Times New Roman" w:hAnsi="Times New Roman"/>
-      <w:color w:val="000000"/>
-      <w:sz w:val="24"/>
-    </w:rPr>
+      <w:jc w:val="center"/>
+    </w:pPr>
   </w:style>
   <w:style w:customStyle="1" w:styleId="AbstractTitle" w:type="paragraph">
     <w:name w:val="Abstract Title"/>
@@ -726,15 +355,15 @@
     <w:pPr>
       <w:keepNext/>
       <w:keepLines/>
-      <w:jc w:val="both"/>
-      <w:spacing w:after="0" w:before="300" w:line="276" w:lineRule="auto"/>
-    </w:pPr>
-    <w:rPr>
-      <w:color w:val="000000"/>
-      <w:sz w:val="24"/>
+      <w:jc w:val="center"/>
+      <w:spacing w:after="0" w:before="300"/>
+    </w:pPr>
+    <w:rPr>
+      <w:sz w:val="20"/>
       <w:szCs w:val="20"/>
-      <w:rFonts w:ascii="Times New Roman" w:eastAsia="Times New Roman" w:hAnsi="Times New Roman"/>
-      <w:b/>
+      <w:b/>
+      <w:color w:val="345A8A"/>
+      &gt;
     </w:rPr>
   </w:style>
   <w:style w:customStyle="1" w:styleId="Abstract" w:type="paragraph">
@@ -745,13 +374,10 @@
     <w:pPr>
       <w:keepNext/>
       <w:keepLines/>
-      <w:spacing w:after="300" w:before="100" w:line="276" w:lineRule="auto"/>
-      <w:jc w:val="both"/>
-    </w:pPr>
-    <w:rPr>
-      <w:rFonts w:ascii="Times New Roman" w:eastAsia="Times New Roman" w:hAnsi="Times New Roman"/>
-      <w:color w:val="000000"/>
-      <w:sz w:val="24"/>
+      <w:spacing w:after="300" w:before="100"/>
+    </w:pPr>
+    <w:rPr>
+      <w:sz w:val="20"/>
       <w:szCs w:val="20"/>
     </w:rPr>
   </w:style>
@@ -760,15 +386,8 @@
     <w:basedOn w:val="Normal"/>
     <w:next w:val="Bibliography"/>
     <w:qFormat/>
-    <w:pPr>
-      <w:spacing w:line="276" w:lineRule="auto"/>
-      <w:jc w:val="both"/>
-    </w:pPr>
-    <w:rPr>
-      <w:rFonts w:ascii="Times New Roman" w:eastAsia="Times New Roman" w:hAnsi="Times New Roman"/>
-      <w:color w:val="000000"/>
-      <w:sz w:val="24"/>
-    </w:rPr>
+    <w:pPr/>
+    <w:rPr/>
   </w:style>
   <w:style w:styleId="Heading1" w:type="paragraph">
     <w:name w:val="Heading 1"/>
@@ -779,16 +398,15 @@
     <w:pPr>
       <w:keepNext/>
       <w:keepLines/>
-      <w:spacing w:after="0" w:before="480" w:line="276" w:lineRule="auto"/>
-      <w:jc w:val="both"/>
+      <w:spacing w:after="0" w:before="480"/>
       <w:outlineLvl w:val="0"/>
     </w:pPr>
     <w:rPr>
-      <w:rFonts w:ascii="Times New Roman" w:asciiTheme="majorHAnsi" w:cstheme="majorBidi" w:eastAsia="Times New Roman" w:eastAsiaTheme="majorEastAsia" w:hAnsi="Times New Roman" w:hAnsiTheme="majorHAnsi"/>
+      <w:rFonts w:asciiTheme="majorHAnsi" w:cstheme="majorBidi" w:eastAsiaTheme="majorEastAsia" w:hAnsiTheme="majorHAnsi"/>
       <w:b/>
       <w:bCs/>
-      <w:color w:val="000000"/>
-      <w:sz w:val="24"/>
+      <w:color w:themeColor="accent1" w:val="4F81BD"/>
+      <w:sz w:val="32"/>
       <w:szCs w:val="32"/>
     </w:rPr>
   </w:style>
@@ -802,16 +420,15 @@
     <w:pPr>
       <w:keepNext/>
       <w:keepLines/>
-      <w:spacing w:after="0" w:before="200" w:line="276" w:lineRule="auto"/>
-      <w:jc w:val="both"/>
+      <w:spacing w:after="0" w:before="200"/>
       <w:outlineLvl w:val="1"/>
     </w:pPr>
     <w:rPr>
-      <w:rFonts w:ascii="Times New Roman" w:asciiTheme="majorHAnsi" w:cstheme="majorBidi" w:eastAsia="Times New Roman" w:eastAsiaTheme="majorEastAsia" w:hAnsi="Times New Roman" w:hAnsiTheme="majorHAnsi"/>
+      <w:rFonts w:asciiTheme="majorHAnsi" w:cstheme="majorBidi" w:eastAsiaTheme="majorEastAsia" w:hAnsiTheme="majorHAnsi"/>
       <w:b/>
       <w:bCs/>
-      <w:color w:val="000000"/>
-      <w:sz w:val="24"/>
+      <w:color w:themeColor="accent1" w:val="4F81BD"/>
+      <w:sz w:val="28"/>
       <w:szCs w:val="28"/>
     </w:rPr>
   </w:style>
@@ -825,15 +442,14 @@
     <w:pPr>
       <w:keepNext/>
       <w:keepLines/>
-      <w:spacing w:after="0" w:before="200" w:line="276" w:lineRule="auto"/>
-      <w:jc w:val="both"/>
+      <w:spacing w:after="0" w:before="200"/>
       <w:outlineLvl w:val="2"/>
     </w:pPr>
     <w:rPr>
-      <w:rFonts w:ascii="Times New Roman" w:asciiTheme="majorHAnsi" w:cstheme="majorBidi" w:eastAsia="Times New Roman" w:eastAsiaTheme="majorEastAsia" w:hAnsi="Times New Roman" w:hAnsiTheme="majorHAnsi"/>
+      <w:rFonts w:asciiTheme="majorHAnsi" w:cstheme="majorBidi" w:eastAsiaTheme="majorEastAsia" w:hAnsiTheme="majorHAnsi"/>
       <w:b/>
       <w:bCs/>
-      <w:color w:val="000000"/>
+      <w:color w:themeColor="accent1" w:val="4F81BD"/>
       <w:sz w:val="24"/>
       <w:szCs w:val="24"/>
     </w:rPr>
@@ -848,15 +464,14 @@
     <w:pPr>
       <w:keepNext/>
       <w:keepLines/>
-      <w:spacing w:after="0" w:before="200" w:line="276" w:lineRule="auto"/>
-      <w:jc w:val="both"/>
+      <w:spacing w:after="0" w:before="200"/>
       <w:outlineLvl w:val="3"/>
     </w:pPr>
     <w:rPr>
-      <w:rFonts w:ascii="Times New Roman" w:asciiTheme="majorHAnsi" w:cstheme="majorBidi" w:eastAsia="Times New Roman" w:eastAsiaTheme="majorEastAsia" w:hAnsi="Times New Roman" w:hAnsiTheme="majorHAnsi"/>
+      <w:rFonts w:asciiTheme="majorHAnsi" w:cstheme="majorBidi" w:eastAsiaTheme="majorEastAsia" w:hAnsiTheme="majorHAnsi"/>
       <w:i/>
       <w:bCs/>
-      <w:color w:val="000000"/>
+      <w:color w:themeColor="accent1" w:val="4F81BD"/>
       <w:sz w:val="24"/>
       <w:szCs w:val="24"/>
     </w:rPr>
@@ -871,14 +486,13 @@
     <w:pPr>
       <w:keepNext/>
       <w:keepLines/>
-      <w:spacing w:after="0" w:before="200" w:line="276" w:lineRule="auto"/>
-      <w:jc w:val="both"/>
+      <w:spacing w:after="0" w:before="200"/>
       <w:outlineLvl w:val="4"/>
     </w:pPr>
     <w:rPr>
-      <w:rFonts w:ascii="Times New Roman" w:asciiTheme="majorHAnsi" w:cstheme="majorBidi" w:eastAsia="Times New Roman" w:eastAsiaTheme="majorEastAsia" w:hAnsi="Times New Roman" w:hAnsiTheme="majorHAnsi"/>
+      <w:rFonts w:asciiTheme="majorHAnsi" w:cstheme="majorBidi" w:eastAsiaTheme="majorEastAsia" w:hAnsiTheme="majorHAnsi"/>
       <w:iCs/>
-      <w:color w:val="000000"/>
+      <w:color w:themeColor="accent1" w:val="4F81BD"/>
       <w:sz w:val="24"/>
       <w:szCs w:val="24"/>
     </w:rPr>
@@ -893,13 +507,12 @@
     <w:pPr>
       <w:keepNext/>
       <w:keepLines/>
-      <w:spacing w:after="0" w:before="200" w:line="276" w:lineRule="auto"/>
-      <w:jc w:val="both"/>
+      <w:spacing w:after="0" w:before="200"/>
       <w:outlineLvl w:val="5"/>
     </w:pPr>
     <w:rPr>
-      <w:rFonts w:ascii="Times New Roman" w:asciiTheme="majorHAnsi" w:cstheme="majorBidi" w:eastAsia="Times New Roman" w:eastAsiaTheme="majorEastAsia" w:hAnsi="Times New Roman" w:hAnsiTheme="majorHAnsi"/>
-      <w:color w:val="000000"/>
+      <w:rFonts w:asciiTheme="majorHAnsi" w:cstheme="majorBidi" w:eastAsiaTheme="majorEastAsia" w:hAnsiTheme="majorHAnsi"/>
+      <w:color w:themeColor="accent1" w:val="4F81BD"/>
       <w:sz w:val="24"/>
       <w:szCs w:val="24"/>
     </w:rPr>
@@ -914,13 +527,12 @@
     <w:pPr>
       <w:keepNext/>
       <w:keepLines/>
-      <w:spacing w:after="0" w:before="200" w:line="276" w:lineRule="auto"/>
-      <w:jc w:val="both"/>
+      <w:spacing w:after="0" w:before="200"/>
       <w:outlineLvl w:val="6"/>
     </w:pPr>
     <w:rPr>
-      <w:rFonts w:ascii="Times New Roman" w:asciiTheme="majorHAnsi" w:cstheme="majorBidi" w:eastAsia="Times New Roman" w:eastAsiaTheme="majorEastAsia" w:hAnsi="Times New Roman" w:hAnsiTheme="majorHAnsi"/>
-      <w:color w:val="000000"/>
+      <w:rFonts w:asciiTheme="majorHAnsi" w:cstheme="majorBidi" w:eastAsiaTheme="majorEastAsia" w:hAnsiTheme="majorHAnsi"/>
+      <w:color w:themeColor="accent1" w:val="4F81BD"/>
       <w:sz w:val="24"/>
       <w:szCs w:val="24"/>
     </w:rPr>
@@ -935,13 +547,12 @@
     <w:pPr>
       <w:keepNext/>
       <w:keepLines/>
-      <w:spacing w:after="0" w:before="200" w:line="276" w:lineRule="auto"/>
-      <w:jc w:val="both"/>
+      <w:spacing w:after="0" w:before="200"/>
       <w:outlineLvl w:val="7"/>
     </w:pPr>
     <w:rPr>
-      <w:rFonts w:ascii="Times New Roman" w:asciiTheme="majorHAnsi" w:cstheme="majorBidi" w:eastAsia="Times New Roman" w:eastAsiaTheme="majorEastAsia" w:hAnsi="Times New Roman" w:hAnsiTheme="majorHAnsi"/>
-      <w:color w:val="000000"/>
+      <w:rFonts w:asciiTheme="majorHAnsi" w:cstheme="majorBidi" w:eastAsiaTheme="majorEastAsia" w:hAnsiTheme="majorHAnsi"/>
+      <w:color w:themeColor="accent1" w:val="4F81BD"/>
       <w:sz w:val="24"/>
       <w:szCs w:val="24"/>
     </w:rPr>
@@ -956,13 +567,12 @@
     <w:pPr>
       <w:keepNext/>
       <w:keepLines/>
-      <w:spacing w:after="0" w:before="200" w:line="276" w:lineRule="auto"/>
-      <w:jc w:val="both"/>
+      <w:spacing w:after="0" w:before="200"/>
       <w:outlineLvl w:val="8"/>
     </w:pPr>
     <w:rPr>
-      <w:rFonts w:ascii="Times New Roman" w:asciiTheme="majorHAnsi" w:cstheme="majorBidi" w:eastAsia="Times New Roman" w:eastAsiaTheme="majorEastAsia" w:hAnsi="Times New Roman" w:hAnsiTheme="majorHAnsi"/>
-      <w:color w:val="000000"/>
+      <w:rFonts w:asciiTheme="majorHAnsi" w:cstheme="majorBidi" w:eastAsiaTheme="majorEastAsia" w:hAnsiTheme="majorHAnsi"/>
+      <w:color w:themeColor="accent1" w:val="4F81BD"/>
       <w:sz w:val="24"/>
       <w:szCs w:val="24"/>
     </w:rPr>
@@ -975,15 +585,9 @@
     <w:unhideWhenUsed/>
     <w:qFormat/>
     <w:pPr>
-      <w:spacing w:after="100" w:before="100" w:line="276" w:lineRule="auto"/>
+      <w:spacing w:after="100" w:before="100"/>
       <w:ind w:firstLine="0" w:left="480" w:right="480"/>
-      <w:jc w:val="both"/>
-    </w:pPr>
-    <w:rPr>
-      <w:rFonts w:ascii="Times New Roman" w:eastAsia="Times New Roman" w:hAnsi="Times New Roman"/>
-      <w:color w:val="000000"/>
-      <w:sz w:val="24"/>
-    </w:rPr>
+    </w:pPr>
   </w:style>
   <w:style w:styleId="FootnoteText" w:type="paragraph">
     <w:name w:val="Footnote Text"/>
@@ -992,25 +596,11 @@
     <w:uiPriority w:val="9"/>
     <w:unhideWhenUsed/>
     <w:qFormat/>
-    <w:pPr>
-      <w:spacing w:line="276" w:lineRule="auto"/>
-      <w:jc w:val="both"/>
-    </w:pPr>
-    <w:rPr>
-      <w:rFonts w:ascii="Times New Roman" w:eastAsia="Times New Roman" w:hAnsi="Times New Roman"/>
-      <w:color w:val="000000"/>
-      <w:sz w:val="24"/>
-    </w:rPr>
   </w:style>
   <w:style w:default="1" w:styleId="DefaultParagraphFont" w:type="character">
     <w:name w:val="Default Paragraph Font"/>
     <w:semiHidden/>
     <w:unhideWhenUsed/>
-    <w:rPr>
-      <w:rFonts w:ascii="Times New Roman" w:eastAsia="Times New Roman" w:hAnsi="Times New Roman"/>
-      <w:color w:val="000000"/>
-      <w:sz w:val="24"/>
-    </w:rPr>
   </w:style>
   <w:style w:default="1" w:styleId="Table" w:type="table">
     <w:name w:val="Table"/>
@@ -1018,15 +608,6 @@
     <w:semiHidden/>
     <w:unhideWhenUsed/>
     <w:qFormat/>
-    <w:pPr>
-      <w:spacing w:line="276" w:lineRule="auto"/>
-      <w:jc w:val="both"/>
-    </w:pPr>
-    <w:rPr>
-      <w:rFonts w:ascii="Times New Roman" w:eastAsia="Times New Roman" w:hAnsi="Times New Roman"/>
-      <w:color w:val="000000"/>
-      <w:sz w:val="24"/>
-    </w:rPr>
     <w:tblPr>
       <w:tblInd w:type="dxa" w:w="0"/>
       <w:tblCellMar>
@@ -1059,42 +640,25 @@
     <w:pPr>
       <w:keepNext/>
       <w:keepLines/>
-      <w:spacing w:after="0" w:line="276" w:lineRule="auto"/>
-      <w:jc w:val="both"/>
-    </w:pPr>
-    <w:rPr>
-      <w:rFonts w:ascii="Times New Roman" w:eastAsia="Times New Roman" w:hAnsi="Times New Roman"/>
-      <w:b/>
-      <w:color w:val="000000"/>
-      <w:sz w:val="24"/>
+      <w:spacing w:after="0"/>
+    </w:pPr>
+    <w:rPr>
+      <w:b/>
     </w:rPr>
   </w:style>
   <w:style w:customStyle="1" w:styleId="Definition" w:type="paragraph">
     <w:name w:val="Definition"/>
     <w:basedOn w:val="Normal"/>
-    <w:pPr>
-      <w:spacing w:line="276" w:lineRule="auto"/>
-      <w:jc w:val="both"/>
-    </w:pPr>
-    <w:rPr>
-      <w:rFonts w:ascii="Times New Roman" w:eastAsia="Times New Roman" w:hAnsi="Times New Roman"/>
-      <w:color w:val="000000"/>
-      <w:sz w:val="24"/>
-    </w:rPr>
   </w:style>
   <w:style w:styleId="Caption" w:type="paragraph">
     <w:name w:val="Caption"/>
     <w:basedOn w:val="Normal"/>
     <w:link w:val="BodyTextChar"/>
     <w:pPr>
-      <w:spacing w:after="120" w:before="0" w:line="276" w:lineRule="auto"/>
-      <w:jc w:val="both"/>
-    </w:pPr>
-    <w:rPr>
-      <w:rFonts w:ascii="Times New Roman" w:eastAsia="Times New Roman" w:hAnsi="Times New Roman"/>
+      <w:spacing w:after="120" w:before="0"/>
+    </w:pPr>
+    <w:rPr>
       <w:i/>
-      <w:color w:val="000000"/>
-      <w:sz w:val="24"/>
     </w:rPr>
   </w:style>
   <w:style w:customStyle="1" w:styleId="TableCaption" w:type="paragraph">
@@ -1102,90 +666,44 @@
     <w:basedOn w:val="Caption"/>
     <w:pPr>
       <w:keepNext/>
-      <w:spacing w:line="276" w:lineRule="auto"/>
-      <w:jc w:val="both"/>
-    </w:pPr>
-    <w:rPr>
-      <w:rFonts w:ascii="Times New Roman" w:eastAsia="Times New Roman" w:hAnsi="Times New Roman"/>
-      <w:color w:val="000000"/>
-      <w:sz w:val="24"/>
-    </w:rPr>
+    </w:pPr>
   </w:style>
   <w:style w:customStyle="1" w:styleId="ImageCaption" w:type="paragraph">
     <w:name w:val="Image Caption"/>
     <w:basedOn w:val="Caption"/>
-    <w:pPr>
-      <w:spacing w:line="276" w:lineRule="auto"/>
-      <w:jc w:val="both"/>
-    </w:pPr>
-    <w:rPr>
-      <w:rFonts w:ascii="Times New Roman" w:eastAsia="Times New Roman" w:hAnsi="Times New Roman"/>
-      <w:color w:val="000000"/>
-      <w:sz w:val="24"/>
-    </w:rPr>
   </w:style>
   <w:style w:customStyle="1" w:styleId="Figure" w:type="paragraph">
     <w:name w:val="Figure"/>
     <w:basedOn w:val="Normal"/>
-    <w:pPr>
-      <w:spacing w:line="276" w:lineRule="auto"/>
-      <w:jc w:val="both"/>
-    </w:pPr>
-    <w:rPr>
-      <w:rFonts w:ascii="Times New Roman" w:eastAsia="Times New Roman" w:hAnsi="Times New Roman"/>
-      <w:color w:val="000000"/>
-      <w:sz w:val="24"/>
-    </w:rPr>
   </w:style>
   <w:style w:customStyle="1" w:styleId="CaptionedFigure" w:type="paragraph">
     <w:name w:val="Captioned Figure"/>
     <w:basedOn w:val="Figure"/>
     <w:pPr>
       <w:keepNext/>
-      <w:spacing w:line="276" w:lineRule="auto"/>
-      <w:jc w:val="both"/>
-    </w:pPr>
-    <w:rPr>
-      <w:rFonts w:ascii="Times New Roman" w:eastAsia="Times New Roman" w:hAnsi="Times New Roman"/>
-      <w:color w:val="000000"/>
-      <w:sz w:val="24"/>
-    </w:rPr>
+    </w:pPr>
   </w:style>
   <w:style w:customStyle="1" w:styleId="BodyTextChar" w:type="character">
     <w:name w:val="Body Text Char"/>
     <w:basedOn w:val="DefaultParagraphFont"/>
     <w:link w:val="BodyText"/>
-    <w:rPr>
-      <w:rFonts w:ascii="Times New Roman" w:eastAsia="Times New Roman" w:hAnsi="Times New Roman"/>
-      <w:color w:val="000000"/>
-      <w:sz w:val="24"/>
-    </w:rPr>
   </w:style>
   <w:style w:customStyle="1" w:styleId="VerbatimChar" w:type="character">
     <w:name w:val="Verbatim Char"/>
     <w:basedOn w:val="BodyTextChar"/>
     <w:rPr>
-      <w:rFonts w:ascii="Times New Roman" w:eastAsia="Times New Roman" w:hAnsi="Times New Roman"/>
-      <w:color w:val="000000"/>
-      <w:sz w:val="24"/>
+      <w:rFonts w:ascii="Consolas" w:hAnsi="Consolas"/>
+      <w:sz w:val="22"/>
     </w:rPr>
   </w:style>
   <w:style w:customStyle="1" w:styleId="SectionNumber" w:type="character">
     <w:name w:val="Section Number"/>
     <w:basedOn w:val="BodyTextChar"/>
-    <w:rPr>
-      <w:rFonts w:ascii="Times New Roman" w:eastAsia="Times New Roman" w:hAnsi="Times New Roman"/>
-      <w:color w:val="000000"/>
-      <w:sz w:val="24"/>
-    </w:rPr>
   </w:style>
   <w:style w:styleId="FootnoteReference" w:type="character">
     <w:name w:val="Footnote Reference"/>
     <w:basedOn w:val="BodyTextChar"/>
     <w:rPr>
-      <w:rFonts w:ascii="Times New Roman" w:eastAsia="Times New Roman" w:hAnsi="Times New Roman"/>
-      <w:color w:val="000000"/>
-      <w:sz w:val="24"/>
       <w:vertAlign w:val="superscript"/>
     </w:rPr>
   </w:style>
@@ -1193,9 +711,7 @@
     <w:name w:val="Hyperlink"/>
     <w:basedOn w:val="BodyTextChar"/>
     <w:rPr>
-      <w:rFonts w:ascii="Times New Roman" w:eastAsia="Times New Roman" w:hAnsi="Times New Roman"/>
-      <w:color w:val="000000"/>
-      <w:sz w:val="24"/>
+      <w:color w:themeColor="accent1" w:val="4F81BD"/>
     </w:rPr>
   </w:style>
   <w:style w:styleId="TOCHeading" w:type="paragraph">
@@ -1206,16 +722,14 @@
     <w:unhideWhenUsed/>
     <w:qFormat/>
     <w:pPr>
-      <w:spacing w:before="240" w:line="276" w:lineRule="auto"/>
-      <w:jc w:val="both"/>
+      <w:spacing w:before="240" w:line="259" w:lineRule="auto"/>
       <w:outlineLvl w:val="9"/>
     </w:pPr>
     <w:rPr>
-      <w:rFonts w:ascii="Times New Roman" w:asciiTheme="majorHAnsi" w:cstheme="majorBidi" w:eastAsia="Times New Roman" w:eastAsiaTheme="majorEastAsia" w:hAnsi="Times New Roman" w:hAnsiTheme="majorHAnsi"/>
+      <w:rFonts w:asciiTheme="majorHAnsi" w:cstheme="majorBidi" w:eastAsiaTheme="majorEastAsia" w:hAnsiTheme="majorHAnsi"/>
       <w:b w:val="0"/>
       <w:bCs w:val="0"/>
-      <w:color w:val="000000"/>
-      <w:sz w:val="24"/>
+      <w:color w:themeColor="accent1" w:themeShade="BF" w:val="365F91"/>
     </w:rPr>
   </w:style>
   <w:style w:type="paragraph" w:customStyle="1" w:styleId="SourceCode">

</xml_diff>